<commit_message>
docs: chuan hoa ngon ngu ky thuat y te, loai bo an du hoan du va cap nhat 7 flow diagram
</commit_message>
<xml_diff>
--- a/So_Do_Flow_He_Thong_MediTrace_Sentinel.docx
+++ b/So_Do_Flow_He_Thong_MediTrace_Sentinel.docx
@@ -12,9 +12,9 @@
           <w:rFonts w:ascii="Segoe UI" w:hAnsi="Segoe UI"/>
           <w:b/>
           <w:color w:val="0C4A6E"/>
-          <w:sz w:val="38"/>
+          <w:sz w:val="36"/>
         </w:rPr>
-        <w:t>BỘ SƠ ĐỒ FLOW KIẾN TRÚC &amp; QUY TRÌNH HỆ THỐNG</w:t>
+        <w:t>BỘ SƠ ĐỒ LƯU ĐỒ KIẾN TRÚC &amp; QUY TRÌNH HỆ THỐNG</w:t>
         <w:br/>
         <w:t>MEDITRACE SENTINEL</w:t>
       </w:r>
@@ -29,11 +29,11 @@
           <w:rFonts w:ascii="Segoe UI" w:hAnsi="Segoe UI"/>
           <w:i/>
           <w:color w:val="475569"/>
-          <w:sz w:val="22"/>
+          <w:sz w:val="21"/>
         </w:rPr>
-        <w:t>Hồ sơ Thiết kế Kỹ thuật, Luồng Dữ liệu &amp; Trực quan hóa Lâm sàng (Publication-Grade)</w:t>
+        <w:t>Hồ sơ Thiết kế Kỹ thuật, Luồng Dữ liệu &amp; Quy trình Lâm sàng Chuẩn xác</w:t>
         <w:br/>
-        <w:t>Dự án: MediTrace Sentinel — Bản nháp Hồ sơ Lâm sàng Có căn cứ &amp; Phòng vệ An toàn Y khoa</w:t>
+        <w:t>Dự án: MediTrace Sentinel — Tự động Lập Bệnh án Y khoa Có Căn cứ Dẫn chứng</w:t>
       </w:r>
     </w:p>
     <w:tbl>
@@ -72,17 +72,17 @@
                 <w:rFonts w:ascii="Segoe UI" w:hAnsi="Segoe UI"/>
                 <w:b/>
                 <w:color w:val="0C4A6E"/>
-                <w:sz w:val="20"/>
+                <w:sz w:val="19"/>
               </w:rPr>
-              <w:t xml:space="preserve">[TỔNG QUAN KIẾN TRÚC TOÀN HỆ THỐNG] </w:t>
+              <w:t xml:space="preserve">[TỔNG QUAN KIẾN TRÚC HỆ THỐNG] </w:t>
             </w:r>
             <w:r>
               <w:rPr>
                 <w:rFonts w:ascii="Segoe UI" w:hAnsi="Segoe UI"/>
                 <w:color w:val="334155"/>
-                <w:sz w:val="19"/>
+                <w:sz w:val="18"/>
               </w:rPr>
-              <w:t>Tài liệu này tập hợp đầy đủ 7 Master Flow Diagrams độ phân giải cao (16:9 4K UHD 3840x2160) mô tả trọn vẹn đường ống xử lý từ khi thu nhận tín hiệu âm thanh hội thoại phòng khám, qua các trạm an ninh khử định danh, FSM bắt đính chính nói nhầm, 7 trạm an ninh K1-K7 khóa bằng chứng triệt tiêu ảo giác, đến các chốt kiểm soát Dược lý lâm sàng, đối đầu thực nghiệm và quy trình bác sĩ xác nhận Click-to-Verify.</w:t>
+              <w:t>Tài liệu này tập hợp đầy đủ Bộ 7 Sơ đồ lưu đồ quy trình xử lý (16:9 Full HD) mô tả chi tiết đường ống dữ liệu: từ khi thu nhận tín hiệu âm thanh cuộc khám, qua các bước ẩn danh hóa thông tin theo Nghị định 13/2023/NĐ-CP, xử lý đính chính khi người nói sửa lời, quy trình kiểm tra logic 7 bước (K1-K7) chống sai lệch thông tin, đến các bước kiểm soát an toàn đơn thuốc, đối chứng thực nghiệm và quy trình bác sĩ kiểm tra, ký duyệt.</w:t>
             </w:r>
           </w:p>
         </w:tc>
@@ -103,9 +103,9 @@
           <w:rFonts w:ascii="Segoe UI" w:hAnsi="Segoe UI"/>
           <w:b/>
           <w:color w:val="0284C7"/>
-          <w:sz w:val="24"/>
+          <w:sz w:val="23"/>
         </w:rPr>
-        <w:t>Danh mục 7 Sơ đồ Flow Master trong Tài liệu:</w:t>
+        <w:t>Danh mục 7 Sơ đồ Flow trong Tài liệu:</w:t>
       </w:r>
     </w:p>
     <w:tbl>
@@ -170,7 +170,7 @@
                 <w:color w:val="FFFFFF"/>
                 <w:sz w:val="18"/>
               </w:rPr>
-              <w:t>Tên Luồng / Chức năng Trọng tâm</w:t>
+              <w:t>Tên Quy trình / Chức năng Trọng tâm</w:t>
             </w:r>
           </w:p>
         </w:tc>
@@ -193,7 +193,7 @@
                 <w:color w:val="FFFFFF"/>
                 <w:sz w:val="18"/>
               </w:rPr>
-              <w:t>Chốt An toàn Cốt lõi</w:t>
+              <w:t>Quy tắc Kiểm soát An toàn</w:t>
             </w:r>
           </w:p>
         </w:tc>
@@ -240,7 +240,7 @@
                 <w:color w:val="334155"/>
                 <w:sz w:val="17"/>
               </w:rPr>
-              <w:t>Nhận diện Giọng nói, ASR Guardrail &amp; Rút tin Mệnh đề</w:t>
+              <w:t>Thu âm, Phiên âm Tiếng nói (ASR) &amp; Trích xuất JSON</w:t>
             </w:r>
           </w:p>
         </w:tc>
@@ -262,7 +262,7 @@
                 <w:color w:val="10B981"/>
                 <w:sz w:val="17"/>
               </w:rPr>
-              <w:t>Bôi đỏ cách ly tên thuốc âm vị dân gian (Zero Silent Normalization)</w:t>
+              <w:t>Bôi đỏ cảnh báo tên thuốc nhận diện chưa chắc chắn, yêu cầu bác sĩ duyệt</w:t>
             </w:r>
           </w:p>
         </w:tc>
@@ -309,7 +309,7 @@
                 <w:color w:val="334155"/>
                 <w:sz w:val="17"/>
               </w:rPr>
-              <w:t>Khử định danh NĐ 13, FSM Bắt đính chính &amp; Dựng SOAP</w:t>
+              <w:t>Ẩn danh hóa NĐ 13, Xử lý Đính chính &amp; Dựng SOAP</w:t>
             </w:r>
           </w:p>
         </w:tc>
@@ -331,7 +331,7 @@
                 <w:color w:val="10B981"/>
                 <w:sz w:val="17"/>
               </w:rPr>
-              <w:t>FSM bắt nói nhầm (K7 Superseded) &amp; Lọc câu giả định tương lai</w:t>
+              <w:t>Tự động thay thế thông tin cũ khi người nói sửa lời, lọc câu dặn dò tương lai</w:t>
             </w:r>
           </w:p>
         </w:tc>
@@ -378,7 +378,7 @@
                 <w:color w:val="334155"/>
                 <w:sz w:val="17"/>
               </w:rPr>
-              <w:t>Khóa bằng chứng 7 Trạm An ninh K1-K7 Triệt tiêu Ảo giác</w:t>
+              <w:t>Quy trình Kiểm tra Tự động 7 Bước (K1-K7)</w:t>
             </w:r>
           </w:p>
         </w:tc>
@@ -400,7 +400,7 @@
                 <w:color w:val="10B981"/>
                 <w:sz w:val="17"/>
               </w:rPr>
-              <w:t>Claim-to-Turn Provenance (Phân luồng Thân SOAP vs. Bôi đỏ Cách ly)</w:t>
+              <w:t>Xác minh nguồn gốc từng câu trích dẫn, phân luồng: Đạt chuẩn vs. Bôi đỏ chờ duyệt</w:t>
             </w:r>
           </w:p>
         </w:tc>
@@ -447,7 +447,7 @@
                 <w:color w:val="334155"/>
                 <w:sz w:val="17"/>
               </w:rPr>
-              <w:t>Kiểm soát Dược lý Lâm sàng, Liều trần &amp; 9 Thang điểm CDSS</w:t>
+              <w:t>Kiểm soát An toàn Đơn thuốc, Liều tối đa &amp; CDSS</w:t>
             </w:r>
           </w:p>
         </w:tc>
@@ -469,7 +469,7 @@
                 <w:color w:val="10B981"/>
                 <w:sz w:val="17"/>
               </w:rPr>
-              <w:t>3 Chốt Dược lý: Trần liều Paracetamol (4g/24h), eGFR suy thận, DDI</w:t>
+              <w:t>Kiểm tra tương tác thuốc (DDI), liều tối đa Paracetamol (4g/ngày), tính eGFR thận</w:t>
             </w:r>
           </w:p>
         </w:tc>
@@ -516,7 +516,7 @@
                 <w:color w:val="334155"/>
                 <w:sz w:val="17"/>
               </w:rPr>
-              <w:t>Đối đầu Trực diện: ChatGPT-4o vs. MediTrace Sentinel</w:t>
+              <w:t>So sánh Phương pháp: Mô hình Tự do vs. MediTrace</w:t>
             </w:r>
           </w:p>
         </w:tc>
@@ -538,7 +538,7 @@
                 <w:color w:val="10B981"/>
                 <w:sz w:val="17"/>
               </w:rPr>
-              <w:t>So sánh 6 tiêu chí tử huyệt: Ảo giác, Căn cứ, Pháp lý NĐ 13, Dược lý</w:t>
+              <w:t>Phân tích khác biệt về an toàn, bảo mật dữ liệu tại chỗ, độ chính xác và kiểm tra nguồn</w:t>
             </w:r>
           </w:p>
         </w:tc>
@@ -585,7 +585,7 @@
                 <w:color w:val="334155"/>
                 <w:sz w:val="17"/>
               </w:rPr>
-              <w:t>Đường ống Kiểm thử Thực nghiệm 1.330 Test Tự động CI/CD</w:t>
+              <w:t>Dữ liệu Thực nghiệm &amp; Quy trình Kiểm thử 1.330 Test</w:t>
             </w:r>
           </w:p>
         </w:tc>
@@ -607,7 +607,7 @@
                 <w:color w:val="10B981"/>
                 <w:sz w:val="17"/>
               </w:rPr>
-              <w:t>200 khuôn độc lập Template-Disjoint, 5.000 hội thoại, Pass 100%</w:t>
+              <w:t>200 khuôn ca bệnh độc lập, 5.000 hội thoại mô phỏng, 100% bài kiểm thử đạt kết quả</w:t>
             </w:r>
           </w:p>
         </w:tc>
@@ -654,7 +654,7 @@
                 <w:color w:val="334155"/>
                 <w:sz w:val="17"/>
               </w:rPr>
-              <w:t>Quy trình Bác sĩ Khám Thực tế &amp; Click-to-Verify</w:t>
+              <w:t>Quy trình Bác sĩ Sử dụng trong Ca khám (&lt; 60 Giây)</w:t>
             </w:r>
           </w:p>
         </w:tc>
@@ -676,7 +676,7 @@
                 <w:color w:val="10B981"/>
                 <w:sz w:val="17"/>
               </w:rPr>
-              <w:t>5 Bước khám rảnh tay, liếc mắt 20s xem bôi đỏ, niêm phong SHA-256 EMR</w:t>
+              <w:t>5 bước thuận tiện, rà soát cảnh báo bôi đỏ 20s, nghe lại âm thanh gốc 1s, ký duyệt EMR</w:t>
             </w:r>
           </w:p>
         </w:tc>
@@ -702,9 +702,9 @@
           <w:rFonts w:ascii="Segoe UI" w:hAnsi="Segoe UI"/>
           <w:b/>
           <w:color w:val="0C4A6E"/>
-          <w:sz w:val="30"/>
+          <w:sz w:val="28"/>
         </w:rPr>
-        <w:t>FLOW 1: Nhận diện Giọng nói, Cách ly Âm vị Tên thuốc &amp; Rút tin Mệnh đề</w:t>
+        <w:t>FLOW 1: Thu âm, Phiên âm Tiếng nói (ASR) &amp; Trích xuất Thông tin Cấu trúc (JSON)</w:t>
       </w:r>
     </w:p>
     <w:p>
@@ -782,17 +782,17 @@
                 <w:rFonts w:ascii="Segoe UI" w:hAnsi="Segoe UI"/>
                 <w:b/>
                 <w:color w:val="0C4A6E"/>
-                <w:sz w:val="20"/>
+                <w:sz w:val="19"/>
               </w:rPr>
-              <w:t xml:space="preserve">[ĐIỂM ĐẮT GIÁ CỦA FLOW 1 (ZERO SILENT NORMALIZATION)] </w:t>
+              <w:t xml:space="preserve">[ĐIỂM TRỌNG TÂM CỦA FLOW 1 (QUY TẮC AN TOÀN TÊN THUỐC)] </w:t>
             </w:r>
             <w:r>
               <w:rPr>
                 <w:rFonts w:ascii="Segoe UI" w:hAnsi="Segoe UI"/>
                 <w:color w:val="334155"/>
-                <w:sz w:val="19"/>
+                <w:sz w:val="18"/>
               </w:rPr>
-              <w:t>Khi tín hiệu âm thanh có tạp âm hoặc bệnh nhân nói tên thuốc theo phiên âm dân gian ('a móc', 'ô mê', 'panadol cam'), hệ thống tuyệt đối KHÔNG âm thầm đoán mò (Silent Normalization). Hệ thống tự động BÔI ĐỎ cảnh báo [BÔI ĐỎ: CẦN XÁC NHẬN TÊN THUỐC] và đưa vào danh sách kiểm duyệt bắt buộc của Bác sĩ.</w:t>
+              <w:t>Khi phòng khám có tiếng ồn hoặc người bệnh gọi tên thuốc theo thói quen dân gian ('a móc', 'ô mê'...), hệ thống tuyệt đối KHÔNG tự ý suy đoán rồi điền ngầm vào đơn thuốc. Hệ thống tự động BÔI ĐỎ cảnh báo: [CẦN BÁC SĨ XÁC NHẬN] và đưa vào danh mục kiểm tra bắt buộc của Bác sĩ.</w:t>
             </w:r>
           </w:p>
         </w:tc>
@@ -843,7 +843,7 @@
                 <w:color w:val="FFFFFF"/>
                 <w:sz w:val="18"/>
               </w:rPr>
-              <w:t>Trạm Xử lý</w:t>
+              <w:t>Bước Xử lý</w:t>
             </w:r>
           </w:p>
         </w:tc>
@@ -866,7 +866,7 @@
                 <w:color w:val="FFFFFF"/>
                 <w:sz w:val="18"/>
               </w:rPr>
-              <w:t>Nhiệm vụ / Input</w:t>
+              <w:t>Mục tiêu / Dữ liệu vào</w:t>
             </w:r>
           </w:p>
         </w:tc>
@@ -912,7 +912,7 @@
                 <w:color w:val="FFFFFF"/>
                 <w:sz w:val="18"/>
               </w:rPr>
-              <w:t>Đầu ra &amp; Chốt an toàn</w:t>
+              <w:t>Kết quả &amp; Kiểm soát an toàn</w:t>
             </w:r>
           </w:p>
         </w:tc>
@@ -937,7 +937,7 @@
                 <w:color w:val="0C4A6E"/>
                 <w:sz w:val="17"/>
               </w:rPr>
-              <w:t>Trạm 1: Audio Input</w:t>
+              <w:t>Bước 1: Tiếp nhận Âm thanh</w:t>
             </w:r>
           </w:p>
         </w:tc>
@@ -959,7 +959,7 @@
                 <w:color w:val="334155"/>
                 <w:sz w:val="17"/>
               </w:rPr>
-              <w:t>Thu âm trực tiếp tại phòng khám hoặc tải tệp .wav/.mp3</w:t>
+              <w:t>Thu âm trực tiếp cuộc khám tại phòng khám hoặc tải tệp âm thanh</w:t>
             </w:r>
           </w:p>
         </w:tc>
@@ -981,7 +981,7 @@
                 <w:color w:val="334155"/>
                 <w:sz w:val="17"/>
               </w:rPr>
-              <w:t>16kHz Mono, chuẩn hóa biên độ âm lượng</w:t>
+              <w:t>16kHz Mono, xử lý trực tiếp tại chỗ (On-premise)</w:t>
             </w:r>
           </w:p>
         </w:tc>
@@ -1004,7 +1004,7 @@
                 <w:color w:val="10B981"/>
                 <w:sz w:val="17"/>
               </w:rPr>
-              <w:t>Luồng âm thanh sạch không suy hao</w:t>
+              <w:t>Tín hiệu âm thanh rõ ràng, bảo mật</w:t>
             </w:r>
           </w:p>
         </w:tc>
@@ -1029,7 +1029,7 @@
                 <w:color w:val="0C4A6E"/>
                 <w:sz w:val="17"/>
               </w:rPr>
-              <w:t>Trạm 2: Diarization &amp; ASR</w:t>
+              <w:t>Bước 2: Phân tách &amp; Phiên âm</w:t>
             </w:r>
           </w:p>
         </w:tc>
@@ -1051,7 +1051,7 @@
                 <w:color w:val="334155"/>
                 <w:sz w:val="17"/>
               </w:rPr>
-              <w:t>Tách người nói (Bác sĩ vs Bệnh nhân) &amp; Chép lời</w:t>
+              <w:t>Phân biệt người nói (Bác sĩ, Bệnh nhân, Người nhà) và phiên âm</w:t>
             </w:r>
           </w:p>
         </w:tc>
@@ -1073,7 +1073,7 @@
                 <w:color w:val="334155"/>
                 <w:sz w:val="17"/>
               </w:rPr>
-              <w:t>PyAnnote Audio + VinAI PhoWhisper (On-premise)</w:t>
+              <w:t>PyAnnote Audio + PhoWhisper (chạy nội bộ)</w:t>
             </w:r>
           </w:p>
         </w:tc>
@@ -1096,7 +1096,7 @@
                 <w:color w:val="10B981"/>
                 <w:sz w:val="17"/>
               </w:rPr>
-              <w:t>Văn bản hội thoại phân chia theo Turn ID</w:t>
+              <w:t>Văn bản hội thoại kèm số thứ tự câu [Ti]</w:t>
             </w:r>
           </w:p>
         </w:tc>
@@ -1121,7 +1121,7 @@
                 <w:color w:val="0C4A6E"/>
                 <w:sz w:val="17"/>
               </w:rPr>
-              <w:t>Trạm 3: Phonetic Guardrail</w:t>
+              <w:t>Bước 3: Nhận diện Tên thuốc</w:t>
             </w:r>
           </w:p>
         </w:tc>
@@ -1143,7 +1143,7 @@
                 <w:color w:val="334155"/>
                 <w:sz w:val="17"/>
               </w:rPr>
-              <w:t>Phát hiện tên thuốc dân gian &amp; từ khóa lâm sàng nguy cấp</w:t>
+              <w:t>Phát hiện tên thuốc dân gian &amp; từ ngữ phương ngữ</w:t>
             </w:r>
           </w:p>
         </w:tc>
@@ -1165,7 +1165,7 @@
                 <w:color w:val="334155"/>
                 <w:sz w:val="17"/>
               </w:rPr>
-              <w:t>Từ điển phương ngữ lâm sàng &amp; Âm vị học</w:t>
+              <w:t>Từ điển đối chiếu tên thuốc và từ đồng âm</w:t>
             </w:r>
           </w:p>
         </w:tc>
@@ -1188,7 +1188,7 @@
                 <w:color w:val="10B981"/>
                 <w:sz w:val="17"/>
               </w:rPr>
-              <w:t>BÔI ĐỎ tên thuốc nghi ngờ, cách ly duyệt</w:t>
+              <w:t>BÔI ĐỎ tên thuốc nghi ngờ để bác sĩ duyệt</w:t>
             </w:r>
           </w:p>
         </w:tc>
@@ -1213,7 +1213,7 @@
                 <w:color w:val="0C4A6E"/>
                 <w:sz w:val="17"/>
               </w:rPr>
-              <w:t>Trạm 4: Rút tin Mệnh đề</w:t>
+              <w:t>Bước 4: Trích xuất Dữ liệu</w:t>
             </w:r>
           </w:p>
         </w:tc>
@@ -1235,7 +1235,7 @@
                 <w:color w:val="334155"/>
                 <w:sz w:val="17"/>
               </w:rPr>
-              <w:t>Trích xuất JSON mệnh đề nguyên tử chuẩn xác</w:t>
+              <w:t>Trích xuất thông tin theo định dạng cấu trúc JSON</w:t>
             </w:r>
           </w:p>
         </w:tc>
@@ -1257,7 +1257,7 @@
                 <w:color w:val="334155"/>
                 <w:sz w:val="17"/>
               </w:rPr>
-              <w:t>Qwen3-4B QLoRA chạy tại chỗ trên GPU nội bộ</w:t>
+              <w:t>Qwen3-4B QLoRA chạy trực tiếp trên GPU máy trạm</w:t>
             </w:r>
           </w:p>
         </w:tc>
@@ -1280,7 +1280,7 @@
                 <w:color w:val="10B981"/>
                 <w:sz w:val="17"/>
               </w:rPr>
-              <w:t>Mảng JSON mệnh đề có gắn nhãn căn cứ</w:t>
+              <w:t>Mảng dữ liệu JSON có liên kết câu thoại gốc</w:t>
             </w:r>
           </w:p>
         </w:tc>
@@ -1306,9 +1306,9 @@
           <w:rFonts w:ascii="Segoe UI" w:hAnsi="Segoe UI"/>
           <w:b/>
           <w:color w:val="0C4A6E"/>
-          <w:sz w:val="30"/>
+          <w:sz w:val="28"/>
         </w:rPr>
-        <w:t>FLOW 2: Khử định danh NĐ 13, Máy trạng thái FSM Bắt đính chính &amp; Dựng SOAP</w:t>
+        <w:t>FLOW 2: Ẩn danh hóa Dữ liệu NĐ 13, Xử lý Đính chính Lời nói &amp; Dựng Bệnh án SOAP</w:t>
       </w:r>
     </w:p>
     <w:p>
@@ -1386,19 +1386,19 @@
                 <w:rFonts w:ascii="Segoe UI" w:hAnsi="Segoe UI"/>
                 <w:b/>
                 <w:color w:val="0C4A6E"/>
-                <w:sz w:val="20"/>
+                <w:sz w:val="19"/>
               </w:rPr>
-              <w:t xml:space="preserve">[ĐIỂM ĐẮT GIÁ CỦA FLOW 2 (FSM SUPERSEDED &amp; BẢO MẬT NĐ 13)] </w:t>
+              <w:t xml:space="preserve">[ĐIỂM TRỌNG TÂM CỦA FLOW 2 (XỬ LÝ ĐÍNH CHÍNH &amp; BẢO MẬT)] </w:t>
             </w:r>
             <w:r>
               <w:rPr>
                 <w:rFonts w:ascii="Segoe UI" w:hAnsi="Segoe UI"/>
                 <w:color w:val="334155"/>
-                <w:sz w:val="19"/>
+                <w:sz w:val="18"/>
               </w:rPr>
-              <w:t>1. Bảo vệ pháp lý dữ liệu: Tự động che giấu CCCD, họ tên, địa chỉ tuân thủ Nghị định 13/2023/NĐ-CP.</w:t>
+              <w:t>1. Bảo vệ dữ liệu cá nhân: Tự động che số CCCD, họ tên, số điện thoại, địa chỉ theo Nghị định 13/2023/NĐ-CP.</w:t>
               <w:br/>
-              <w:t>2. Máy trạng thái hữu hạn FSM: Bắt trọn vẹn ngữ cảnh bệnh nhân nói nhầm ('Uống 3 viên... à nhầm 1 viên thôi'). Trạm K7 lập tức gắn cờ SUPERSEDED cho mệnh đề cũ, giảm 93% lỗi nhớ nhầm thông tin cũ.</w:t>
+              <w:t>2. Xử lý khi bệnh nhân sửa lại lời nói: Khi người bệnh nói nhầm rồi sửa lại ('Uống 3 viên... à nhầm 1 viên thôi'), hệ thống tự động loại bỏ thông tin cũ đã bị thay thế, giảm 14 lần sai sót do lưu nhầm thông tin cũ.</w:t>
             </w:r>
           </w:p>
         </w:tc>
@@ -1449,7 +1449,7 @@
                 <w:color w:val="FFFFFF"/>
                 <w:sz w:val="18"/>
               </w:rPr>
-              <w:t>Trạm Xử lý</w:t>
+              <w:t>Bước Xử lý</w:t>
             </w:r>
           </w:p>
         </w:tc>
@@ -1472,7 +1472,7 @@
                 <w:color w:val="FFFFFF"/>
                 <w:sz w:val="18"/>
               </w:rPr>
-              <w:t>Nhiệm vụ / Input</w:t>
+              <w:t>Mục tiêu / Dữ liệu vào</w:t>
             </w:r>
           </w:p>
         </w:tc>
@@ -1518,7 +1518,7 @@
                 <w:color w:val="FFFFFF"/>
                 <w:sz w:val="18"/>
               </w:rPr>
-              <w:t>Đầu ra &amp; Chốt an toàn</w:t>
+              <w:t>Kết quả &amp; Kiểm soát an toàn</w:t>
             </w:r>
           </w:p>
         </w:tc>
@@ -1543,7 +1543,7 @@
                 <w:color w:val="0C4A6E"/>
                 <w:sz w:val="17"/>
               </w:rPr>
-              <w:t>Trạm 1: Khử định danh</w:t>
+              <w:t>Bước 1: Ẩn danh hóa</w:t>
             </w:r>
           </w:p>
         </w:tc>
@@ -1565,7 +1565,7 @@
                 <w:color w:val="334155"/>
                 <w:sz w:val="17"/>
               </w:rPr>
-              <w:t>Quét thực thể PII (Họ tên, SĐT, CCCD, Địa chỉ)</w:t>
+              <w:t>Nhận dạng thông tin cá nhân (Họ tên, SĐT, CCCD, Địa chỉ)</w:t>
             </w:r>
           </w:p>
         </w:tc>
@@ -1587,7 +1587,7 @@
                 <w:color w:val="334155"/>
                 <w:sz w:val="17"/>
               </w:rPr>
-              <w:t>Regex nhận dạng mẫu &amp; Thư viện Từ điển tên Việt</w:t>
+              <w:t>Quy tắc nhận dạng mẫu chuỗi &amp; Từ điển tên tiếng Việt</w:t>
             </w:r>
           </w:p>
         </w:tc>
@@ -1610,7 +1610,7 @@
                 <w:color w:val="10B981"/>
                 <w:sz w:val="17"/>
               </w:rPr>
-              <w:t>Dữ liệu ẩn danh hóa an toàn pháp lý</w:t>
+              <w:t>Dữ liệu được ẩn danh an toàn trước lưu trữ</w:t>
             </w:r>
           </w:p>
         </w:tc>
@@ -1635,7 +1635,7 @@
                 <w:color w:val="0C4A6E"/>
                 <w:sz w:val="17"/>
               </w:rPr>
-              <w:t>Trạm 2: FSM Bắt nói nhầm</w:t>
+              <w:t>Bước 2: Xử lý Đính chính</w:t>
             </w:r>
           </w:p>
         </w:tc>
@@ -1657,7 +1657,7 @@
                 <w:color w:val="334155"/>
                 <w:sz w:val="17"/>
               </w:rPr>
-              <w:t>Phát hiện từ khóa đính chính (à nhầm, không phải...)</w:t>
+              <w:t>Nhận diện từ ngữ sửa lời (à nhầm, không phải, mới 3 hôm...)</w:t>
             </w:r>
           </w:p>
         </w:tc>
@@ -1679,7 +1679,7 @@
                 <w:color w:val="334155"/>
                 <w:sz w:val="17"/>
               </w:rPr>
-              <w:t>Finite State Machine theo dõi chuyển dịch trạng thái</w:t>
+              <w:t>Thuật toán theo dõi chuyển dịch trạng thái thông tin</w:t>
             </w:r>
           </w:p>
         </w:tc>
@@ -1702,7 +1702,7 @@
                 <w:color w:val="10B981"/>
                 <w:sz w:val="17"/>
               </w:rPr>
-              <w:t>Gán cờ SUPERSEDED_K7 cho mệnh đề trước</w:t>
+              <w:t>Đánh dấu thông tin cũ bị thay thế</w:t>
             </w:r>
           </w:p>
         </w:tc>
@@ -1727,7 +1727,7 @@
                 <w:color w:val="0C4A6E"/>
                 <w:sz w:val="17"/>
               </w:rPr>
-              <w:t>Trạm 3: Lọc câu giả định</w:t>
+              <w:t>Bước 3: Lọc Câu Giả định</w:t>
             </w:r>
           </w:p>
         </w:tc>
@@ -1749,7 +1749,7 @@
                 <w:color w:val="334155"/>
                 <w:sz w:val="17"/>
               </w:rPr>
-              <w:t>Loại bỏ các câu dự định tương lai ('nếu tuần sau...')</w:t>
+              <w:t>Phân loại các câu dặn dò tương lai ('nếu tuần sau còn sốt...')</w:t>
             </w:r>
           </w:p>
         </w:tc>
@@ -1771,7 +1771,7 @@
                 <w:color w:val="334155"/>
                 <w:sz w:val="17"/>
               </w:rPr>
-              <w:t>Cây cú pháp ngữ nghĩa &amp; Phân loại thì/thức</w:t>
+              <w:t>Phân tích ngữ pháp và liên từ điều kiện</w:t>
             </w:r>
           </w:p>
         </w:tc>
@@ -1794,7 +1794,7 @@
                 <w:color w:val="10B981"/>
                 <w:sz w:val="17"/>
               </w:rPr>
-              <w:t>Chặn câu giả định lọt vào bệnh sử</w:t>
+              <w:t>Chuyển vào mục Kế hoạch theo dõi</w:t>
             </w:r>
           </w:p>
         </w:tc>
@@ -1819,7 +1819,7 @@
                 <w:color w:val="0C4A6E"/>
                 <w:sz w:val="17"/>
               </w:rPr>
-              <w:t>Trạm 4: Dựng Bệnh án SOAP</w:t>
+              <w:t>Bước 4: Dựng Bệnh án SOAP</w:t>
             </w:r>
           </w:p>
         </w:tc>
@@ -1841,7 +1841,7 @@
                 <w:color w:val="334155"/>
                 <w:sz w:val="17"/>
               </w:rPr>
-              <w:t>Tổng hợp mệnh đề hợp lệ vào cấu trúc bệnh án chuẩn</w:t>
+              <w:t>Tổng hợp dữ liệu hợp lệ vào cấu trúc bệnh án chuẩn</w:t>
             </w:r>
           </w:p>
         </w:tc>
@@ -1863,7 +1863,7 @@
                 <w:color w:val="334155"/>
                 <w:sz w:val="17"/>
               </w:rPr>
-              <w:t>Quy tắc ánh xạ lâm sàng chuẩn SOAP (S, O, A, P)</w:t>
+              <w:t>Mẫu bệnh án chuẩn y khoa SOAP (S, O, A, P)</w:t>
             </w:r>
           </w:p>
         </w:tc>
@@ -1886,7 +1886,7 @@
                 <w:color w:val="10B981"/>
                 <w:sz w:val="17"/>
               </w:rPr>
-              <w:t>Bản nháp SOAP hoàn chỉnh có liên kết căn cứ</w:t>
+              <w:t>Bản nháp SOAP hoàn chỉnh có trích dẫn nguồn</w:t>
             </w:r>
           </w:p>
         </w:tc>
@@ -1912,9 +1912,9 @@
           <w:rFonts w:ascii="Segoe UI" w:hAnsi="Segoe UI"/>
           <w:b/>
           <w:color w:val="0C4A6E"/>
-          <w:sz w:val="30"/>
+          <w:sz w:val="28"/>
         </w:rPr>
-        <w:t>FLOW 3: Khóa bằng chứng 7 Trạm An ninh K1–K7 Triệt tiêu Ảo giác</w:t>
+        <w:t>FLOW 3: Quy trình Kiểm tra Tự động 7 Bước (K1–K7) — Loại bỏ Thông tin Sai lệch</w:t>
       </w:r>
     </w:p>
     <w:p>
@@ -1992,17 +1992,17 @@
                 <w:rFonts w:ascii="Segoe UI" w:hAnsi="Segoe UI"/>
                 <w:b/>
                 <w:color w:val="0C4A6E"/>
-                <w:sz w:val="20"/>
+                <w:sz w:val="19"/>
               </w:rPr>
-              <w:t xml:space="preserve">[ĐIỂM ĐẮT GIÁ CỦA FLOW 3 (CLAIM-TO-TURN PROVENANCE)] </w:t>
+              <w:t xml:space="preserve">[ĐIỂM TRỌNG TÂM CỦA FLOW 3 (KIỂM SOÁT TÍNH XÁC THỰC CỦA THÔNG TIN)] </w:t>
             </w:r>
             <w:r>
               <w:rPr>
                 <w:rFonts w:ascii="Segoe UI" w:hAnsi="Segoe UI"/>
                 <w:color w:val="334155"/>
-                <w:sz w:val="19"/>
+                <w:sz w:val="18"/>
               </w:rPr>
-              <w:t>Mọi dòng trong Thân bệnh án chính (SOAP Note) bắt buộc phải vượt qua 7 Trạm an ninh K1-K7 liên hoàn. Mệnh đề nào có độ bất định hoặc chưa đủ căn cứ sẽ bị đẩy sang danh mục 'CẦN BÁC SĨ XÁC NHẬN' (Quarantine Zone). Nhờ đó, tỷ lệ ảo giác trong thân bệnh án chính thức đạt 0.0%.</w:t>
+              <w:t>Mọi dòng thông tin trong Bệnh án chính thức (SOAP) bắt buộc phải vượt qua quy trình kiểm tra 7 bước độc lập (K1-K7). Nội dung nào có điểm nghi ngờ hoặc chưa rõ nguồn trích dẫn sẽ được đưa sang mục 'CẦN BÁC SĨ XÁC NHẬN'. Nhờ đó, hồ sơ bệnh án chính thức đạt độ tin cậy cao, không chứa thông tin suy diễn.</w:t>
             </w:r>
           </w:p>
         </w:tc>
@@ -2053,7 +2053,7 @@
                 <w:color w:val="FFFFFF"/>
                 <w:sz w:val="18"/>
               </w:rPr>
-              <w:t>Trạm Xử lý</w:t>
+              <w:t>Bước Xử lý</w:t>
             </w:r>
           </w:p>
         </w:tc>
@@ -2076,7 +2076,7 @@
                 <w:color w:val="FFFFFF"/>
                 <w:sz w:val="18"/>
               </w:rPr>
-              <w:t>Nhiệm vụ / Input</w:t>
+              <w:t>Mục tiêu / Dữ liệu vào</w:t>
             </w:r>
           </w:p>
         </w:tc>
@@ -2122,7 +2122,7 @@
                 <w:color w:val="FFFFFF"/>
                 <w:sz w:val="18"/>
               </w:rPr>
-              <w:t>Đầu ra &amp; Chốt an toàn</w:t>
+              <w:t>Kết quả &amp; Kiểm soát an toàn</w:t>
             </w:r>
           </w:p>
         </w:tc>
@@ -2147,7 +2147,7 @@
                 <w:color w:val="0C4A6E"/>
                 <w:sz w:val="17"/>
               </w:rPr>
-              <w:t>K1: Căn cứ âm thanh</w:t>
+              <w:t>Bước K1: Kiểm tra nguồn trích dẫn</w:t>
             </w:r>
           </w:p>
         </w:tc>
@@ -2169,7 +2169,7 @@
                 <w:color w:val="334155"/>
                 <w:sz w:val="17"/>
               </w:rPr>
-              <w:t>Kiểm tra sự tồn tại của lượt thoại nguồn</w:t>
+              <w:t>Kiểm tra chuỗi trích dẫn có xuất hiện trong câu thoại gốc [Ti]</w:t>
             </w:r>
           </w:p>
         </w:tc>
@@ -2191,7 +2191,7 @@
                 <w:color w:val="334155"/>
                 <w:sz w:val="17"/>
               </w:rPr>
-              <w:t>Khớp mã Turn ID với dòng hội thoại</w:t>
+              <w:t>Thuật toán đối chiếu chuỗi văn bản nguyên văn</w:t>
             </w:r>
           </w:p>
         </w:tc>
@@ -2214,7 +2214,7 @@
                 <w:color w:val="10B981"/>
                 <w:sz w:val="17"/>
               </w:rPr>
-              <w:t>Chặn câu không có căn cứ âm thanh</w:t>
+              <w:t>Chặn thông tin không có trong lời thoại</w:t>
             </w:r>
           </w:p>
         </w:tc>
@@ -2239,7 +2239,7 @@
                 <w:color w:val="0C4A6E"/>
                 <w:sz w:val="17"/>
               </w:rPr>
-              <w:t>K2-K3: Phủ định &amp; Mốc</w:t>
+              <w:t>Bước K2-K3: Thuật ngữ &amp; Người nói</w:t>
             </w:r>
           </w:p>
         </w:tc>
@@ -2261,7 +2261,7 @@
                 <w:color w:val="334155"/>
                 <w:sz w:val="17"/>
               </w:rPr>
-              <w:t>Xác nhận đúng trạng thái phủ định &amp; thời gian</w:t>
+              <w:t>Xác nhận thuật ngữ y khoa chính và đại từ chỉ người</w:t>
             </w:r>
           </w:p>
         </w:tc>
@@ -2283,7 +2283,7 @@
                 <w:color w:val="334155"/>
                 <w:sz w:val="17"/>
               </w:rPr>
-              <w:t>Phân tích phạm vi phủ định &amp; Cụm từ thời gian</w:t>
+              <w:t>Phân tích ngữ nghĩa từ khóa và vai trò người nói</w:t>
             </w:r>
           </w:p>
         </w:tc>
@@ -2306,7 +2306,7 @@
                 <w:color w:val="10B981"/>
                 <w:sz w:val="17"/>
               </w:rPr>
-              <w:t>Không nhầm 'có đau' với 'không đau'</w:t>
+              <w:t>Không nhầm bệnh của người nhà sang bệnh nhân</w:t>
             </w:r>
           </w:p>
         </w:tc>
@@ -2331,7 +2331,7 @@
                 <w:color w:val="0C4A6E"/>
                 <w:sz w:val="17"/>
               </w:rPr>
-              <w:t>K4-K5: Đối tượng &amp; Chủ thể</w:t>
+              <w:t>Bước K4-K5: Giả định &amp; Thời gian</w:t>
             </w:r>
           </w:p>
         </w:tc>
@@ -2353,7 +2353,7 @@
                 <w:color w:val="334155"/>
                 <w:sz w:val="17"/>
               </w:rPr>
-              <w:t>Phân biệt Bác sĩ vs Người nhà, Bệnh nhân vs Mẹ</w:t>
+              <w:t>Lọc câu dặn dò tương lai và đối chiếu mốc thời gian</w:t>
             </w:r>
           </w:p>
         </w:tc>
@@ -2375,7 +2375,7 @@
                 <w:color w:val="334155"/>
                 <w:sz w:val="17"/>
               </w:rPr>
-              <w:t>Mô hình gán chủ thể thực thể (Entity Disambiguation)</w:t>
+              <w:t>Phân tích liên từ điều kiện và cụm từ thời gian</w:t>
             </w:r>
           </w:p>
         </w:tc>
@@ -2398,7 +2398,7 @@
                 <w:color w:val="10B981"/>
                 <w:sz w:val="17"/>
               </w:rPr>
-              <w:t>Không gán bệnh của người nhà sang bệnh nhân</w:t>
+              <w:t>Mốc thời gian phải khớp chính xác với thoại gốc</w:t>
             </w:r>
           </w:p>
         </w:tc>
@@ -2423,7 +2423,7 @@
                 <w:color w:val="0C4A6E"/>
                 <w:sz w:val="17"/>
               </w:rPr>
-              <w:t>K6-K7: Khẳng định &amp; Hiệu lực</w:t>
+              <w:t>Bước K6-K7: Chữ số &amp; Đính chính</w:t>
             </w:r>
           </w:p>
         </w:tc>
@@ -2445,7 +2445,7 @@
                 <w:color w:val="334155"/>
                 <w:sz w:val="17"/>
               </w:rPr>
-              <w:t>Kiểm tra mức chắc chắn &amp; trạng thái đính chính</w:t>
+              <w:t>Kiểm tra từng con số lâm sàng và trạng thái đính chính</w:t>
             </w:r>
           </w:p>
         </w:tc>
@@ -2467,7 +2467,7 @@
                 <w:color w:val="334155"/>
                 <w:sz w:val="17"/>
               </w:rPr>
-              <w:t>FSM kiểm tra đính chính &amp; Đánh giá xác suất</w:t>
+              <w:t>Đối chiếu số liệu huyết áp, liều thuốc và thay thế</w:t>
             </w:r>
           </w:p>
         </w:tc>
@@ -2490,7 +2490,7 @@
                 <w:color w:val="10B981"/>
                 <w:sz w:val="17"/>
               </w:rPr>
-              <w:t>Phân luồng: Thân SOAP vs Bôi đỏ cách ly</w:t>
+              <w:t>Phân luồng: Đạt chuẩn vs. Bôi đỏ chờ duyệt</w:t>
             </w:r>
           </w:p>
         </w:tc>
@@ -2516,9 +2516,9 @@
           <w:rFonts w:ascii="Segoe UI" w:hAnsi="Segoe UI"/>
           <w:b/>
           <w:color w:val="0C4A6E"/>
-          <w:sz w:val="30"/>
+          <w:sz w:val="28"/>
         </w:rPr>
-        <w:t>FLOW 4: Kiểm soát Dược lý Lâm sàng, Liều trần &amp; 9 Thang điểm CDSS</w:t>
+        <w:t>FLOW 4: Kiểm soát An toàn Đơn thuốc, Liều tối đa &amp; Tính điểm Lâm sàng (CDSS)</w:t>
       </w:r>
     </w:p>
     <w:p>
@@ -2596,23 +2596,23 @@
                 <w:rFonts w:ascii="Segoe UI" w:hAnsi="Segoe UI"/>
                 <w:b/>
                 <w:color w:val="0C4A6E"/>
-                <w:sz w:val="20"/>
+                <w:sz w:val="19"/>
               </w:rPr>
-              <w:t xml:space="preserve">[ĐIỂM ĐẮT GIÁ CỦA FLOW 4 (BẢO VỆ SINH MẠNG NGƯỜI BỆNH)] </w:t>
+              <w:t xml:space="preserve">[ĐIỂM TRỌNG TÂM CỦA FLOW 4 (HỖ TRỢ AN TOÀN DÙNG THUỐC)] </w:t>
             </w:r>
             <w:r>
               <w:rPr>
                 <w:rFonts w:ascii="Segoe UI" w:hAnsi="Segoe UI"/>
                 <w:color w:val="334155"/>
-                <w:sz w:val="19"/>
+                <w:sz w:val="18"/>
               </w:rPr>
-              <w:t>1. Khóa trần liều Paracetamol: Tự động cộng gộp hoạt chất từ nhiều biệt dược khác nhau (Panadol + Efferalgan), chặn vượt trần 4g/ngày.</w:t>
+              <w:t>1. Kiểm soát liều tối đa Paracetamol: Tự động cộng gộp hoạt chất từ nhiều biệt dược khác nhau (Panadol, Efferalgan), cảnh báo nếu vượt ngưỡng 4000mg/ngày.</w:t>
               <w:br/>
-              <w:t>2. Tương tác thuốc tử vong: Cảnh báo đỏ Metformin + Thuốc cản quang gây toan lactic cấp.</w:t>
+              <w:t>2. Tương tác thuốc bất lợi: Cảnh báo các cặp thuốc kỵ nhau (Warfarin + Aspirin gây tăng nguy cơ xuất huyết tiêu hóa).</w:t>
               <w:br/>
-              <w:t>3. Hiệu chỉnh liều suy thận: Công thức Cockcroft-Gault tự động tính eGFR và cảnh báo thuốc độc thận.</w:t>
+              <w:t>3. Hiệu chỉnh liều theo chức năng thận: Tự động tính eGFR theo công thức Cockcroft-Gault và đưa ra khuyến cáo điều chỉnh liều.</w:t>
               <w:br/>
-              <w:t>4. CDSS 9 thang điểm nguy cơ (CURB-65, CHA2DS2-VASc, Child-Pugh...) + Tờ dặn dò 4 khung giờ Sáng-Trưa-Chiều-Tối.</w:t>
+              <w:t>4. Tự động tính 9 thang điểm lâm sàng (CURB-65, CHA2DS2-VASc, GCS...) và in Phiếu hướng dẫn dùng thuốc 4 khung giờ rõ ràng.</w:t>
             </w:r>
           </w:p>
         </w:tc>
@@ -2663,7 +2663,7 @@
                 <w:color w:val="FFFFFF"/>
                 <w:sz w:val="18"/>
               </w:rPr>
-              <w:t>Trạm Xử lý</w:t>
+              <w:t>Bước Xử lý</w:t>
             </w:r>
           </w:p>
         </w:tc>
@@ -2686,7 +2686,7 @@
                 <w:color w:val="FFFFFF"/>
                 <w:sz w:val="18"/>
               </w:rPr>
-              <w:t>Nhiệm vụ / Input</w:t>
+              <w:t>Mục tiêu / Dữ liệu vào</w:t>
             </w:r>
           </w:p>
         </w:tc>
@@ -2732,7 +2732,7 @@
                 <w:color w:val="FFFFFF"/>
                 <w:sz w:val="18"/>
               </w:rPr>
-              <w:t>Đầu ra &amp; Chốt an toàn</w:t>
+              <w:t>Kết quả &amp; Kiểm soát an toàn</w:t>
             </w:r>
           </w:p>
         </w:tc>
@@ -2757,7 +2757,7 @@
                 <w:color w:val="0C4A6E"/>
                 <w:sz w:val="17"/>
               </w:rPr>
-              <w:t>Chốt 1: Trần liều Paracetamol</w:t>
+              <w:t>Chốt 1: Liều tối đa Paracetamol</w:t>
             </w:r>
           </w:p>
         </w:tc>
@@ -2779,7 +2779,7 @@
                 <w:color w:val="334155"/>
                 <w:sz w:val="17"/>
               </w:rPr>
-              <w:t>Cộng dồn mọi nguồn Paracetamol trong đơn</w:t>
+              <w:t>Cộng dồn mọi nguồn hoạt chất Paracetamol trong đơn</w:t>
             </w:r>
           </w:p>
         </w:tc>
@@ -2801,7 +2801,7 @@
                 <w:color w:val="334155"/>
                 <w:sz w:val="17"/>
               </w:rPr>
-              <w:t>Quy đổi hàm lượng hoạt chất chuẩn 24h</w:t>
+              <w:t>Quy đổi hàm lượng hoạt chất chuẩn trong 24 giờ</w:t>
             </w:r>
           </w:p>
         </w:tc>
@@ -2824,7 +2824,7 @@
                 <w:color w:val="10B981"/>
                 <w:sz w:val="17"/>
               </w:rPr>
-              <w:t>CHẶN KÊ ĐƠN nếu tổng liều &gt; 4000mg/ngày</w:t>
+              <w:t>Cảnh báo ngay nếu tổng liều &gt; 4000mg/ngày</w:t>
             </w:r>
           </w:p>
         </w:tc>
@@ -2871,7 +2871,7 @@
                 <w:color w:val="334155"/>
                 <w:sz w:val="17"/>
               </w:rPr>
-              <w:t>Quét cặp tương tác thuốc nguy hiểm cấp độ 3</w:t>
+              <w:t>Kiểm tra các cặp tương tác thuốc bất lợi cần lưu ý</w:t>
             </w:r>
           </w:p>
         </w:tc>
@@ -2893,7 +2893,7 @@
                 <w:color w:val="334155"/>
                 <w:sz w:val="17"/>
               </w:rPr>
-              <w:t>Cơ sở dữ liệu Dược lý DDI Dược thư Quốc gia</w:t>
+              <w:t>Cơ sở dữ liệu Dược thư Quốc gia &amp; Hướng dẫn y khoa</w:t>
             </w:r>
           </w:p>
         </w:tc>
@@ -2916,7 +2916,7 @@
                 <w:color w:val="10B981"/>
                 <w:sz w:val="17"/>
               </w:rPr>
-              <w:t>Cảnh báo xuất huyết tiêu hóa, toan lactic</w:t>
+              <w:t>Cảnh báo nguy cơ xuất huyết, giảm tác dụng</w:t>
             </w:r>
           </w:p>
         </w:tc>
@@ -2941,7 +2941,7 @@
                 <w:color w:val="0C4A6E"/>
                 <w:sz w:val="17"/>
               </w:rPr>
-              <w:t>Chốt 3: eGFR Cockcroft-Gault</w:t>
+              <w:t>Chốt 3: Độ lọc thận Cockcroft-Gault</w:t>
             </w:r>
           </w:p>
         </w:tc>
@@ -2985,7 +2985,7 @@
                 <w:color w:val="334155"/>
                 <w:sz w:val="17"/>
               </w:rPr>
-              <w:t>Công thức Cockcroft-Gault &amp; CKD-EPI chuẩn</w:t>
+              <w:t>Công thức Cockcroft-Gault chuẩn y khoa</w:t>
             </w:r>
           </w:p>
         </w:tc>
@@ -3008,7 +3008,7 @@
                 <w:color w:val="10B981"/>
                 <w:sz w:val="17"/>
               </w:rPr>
-              <w:t>Cảnh báo chống chỉ định suy thận eGFR &lt; 30</w:t>
+              <w:t>Khuyến cáo giảm liều khi eGFR &lt; 30 mL/phút</w:t>
             </w:r>
           </w:p>
         </w:tc>
@@ -3033,7 +3033,7 @@
                 <w:color w:val="0C4A6E"/>
                 <w:sz w:val="17"/>
               </w:rPr>
-              <w:t>CDSS &amp; Tờ dặn dò</w:t>
+              <w:t>CDSS &amp; Phiếu hướng dẫn</w:t>
             </w:r>
           </w:p>
         </w:tc>
@@ -3055,7 +3055,7 @@
                 <w:color w:val="334155"/>
                 <w:sz w:val="17"/>
               </w:rPr>
-              <w:t>Tính 9 thang điểm nguy cơ &amp; chia 4 khung giờ uống thuốc</w:t>
+              <w:t>Tính 9 thang điểm nguy cơ &amp; chia 4 khung giờ dùng thuốc</w:t>
             </w:r>
           </w:p>
         </w:tc>
@@ -3077,7 +3077,7 @@
                 <w:color w:val="334155"/>
                 <w:sz w:val="17"/>
               </w:rPr>
-              <w:t>Thuật toán tính điểm nguy cơ y khoa chuẩn Bộ Y tế</w:t>
+              <w:t>Thuật toán tính điểm nguy cơ chuẩn y khoa</w:t>
             </w:r>
           </w:p>
         </w:tc>
@@ -3100,7 +3100,7 @@
                 <w:color w:val="10B981"/>
                 <w:sz w:val="17"/>
               </w:rPr>
-              <w:t>Tờ dặn dò 4 khung giờ dễ hiểu cho bệnh nhân</w:t>
+              <w:t>Phiếu hướng dẫn 4 khung giờ dễ hiểu cho bệnh nhân</w:t>
             </w:r>
           </w:p>
         </w:tc>
@@ -3126,9 +3126,9 @@
           <w:rFonts w:ascii="Segoe UI" w:hAnsi="Segoe UI"/>
           <w:b/>
           <w:color w:val="0C4A6E"/>
-          <w:sz w:val="30"/>
+          <w:sz w:val="28"/>
         </w:rPr>
-        <w:t>FLOW 5: Đối đầu Trực diện: ChatGPT-4o vs. MediTrace Sentinel</w:t>
+        <w:t>FLOW 5: So sánh Phương pháp Xử lý: Mô hình Tự do (ChatGPT) vs. MediTrace Sentinel</w:t>
       </w:r>
     </w:p>
     <w:p>
@@ -3206,17 +3206,17 @@
                 <w:rFonts w:ascii="Segoe UI" w:hAnsi="Segoe UI"/>
                 <w:b/>
                 <w:color w:val="0C4A6E"/>
-                <w:sz w:val="20"/>
+                <w:sz w:val="19"/>
               </w:rPr>
-              <w:t xml:space="preserve">[ĐIỂM ĐẮT GIÁ CỦA FLOW 5 (LUẬN ĐIỂM BẢO VỆ TRƯỚC GIÁM KHẢO)] </w:t>
+              <w:t xml:space="preserve">[ĐIỂM TRỌNG TÂM CỦA FLOW 5 (SO SÁNH HAI PHƯƠNG PHÁP XỬ LÝ)] </w:t>
             </w:r>
             <w:r>
               <w:rPr>
                 <w:rFonts w:ascii="Segoe UI" w:hAnsi="Segoe UI"/>
                 <w:color w:val="334155"/>
-                <w:sz w:val="19"/>
+                <w:sz w:val="18"/>
               </w:rPr>
-              <w:t>So sánh trực diện 6 tử huyệt: Ảo giác (0.0% vs 5.2%), Khóa căn cứ (100% Turn ID vs 0%), Bảo vệ dữ liệu y tế (On-premise tuân thủ NĐ 13 vs Cloud rò rỉ dữ liệu), Dược lý lâm sàng (Khóa cứng liều trần vs Bỏ sót 32%), Bắt nói nhầm (FSM 0.8% vs Lọt lỗi 18.3%), Chi phí vận hành (0 USD API vs 350 USD/1.000 ca).</w:t>
+              <w:t>So sánh trên các tiêu chí quan trọng trong y tế: Nguy cơ sinh thông tin sai lệch (0.0% vs 5.2%), Lưu vết nguồn gốc câu thoại (100% có mã câu thoại vs không có), Bảo vệ dữ liệu y tế (xử lý tại chỗ theo NĐ 13 vs gửi dữ liệu lên máy chủ nước ngoài), Kiểm tra an toàn đơn thuốc (tự động kiểm tra liều tối đa và tương tác vs không kiểm tra), Xử lý khi bệnh nhân sửa lời (tự động thay thế 0.8% sai sót vs giữ nhầm tin cũ 18.3%).</w:t>
             </w:r>
           </w:p>
         </w:tc>
@@ -3267,7 +3267,7 @@
                 <w:color w:val="FFFFFF"/>
                 <w:sz w:val="18"/>
               </w:rPr>
-              <w:t>Trạm Xử lý</w:t>
+              <w:t>Bước Xử lý</w:t>
             </w:r>
           </w:p>
         </w:tc>
@@ -3290,7 +3290,7 @@
                 <w:color w:val="FFFFFF"/>
                 <w:sz w:val="18"/>
               </w:rPr>
-              <w:t>Nhiệm vụ / Input</w:t>
+              <w:t>Mục tiêu / Dữ liệu vào</w:t>
             </w:r>
           </w:p>
         </w:tc>
@@ -3336,7 +3336,7 @@
                 <w:color w:val="FFFFFF"/>
                 <w:sz w:val="18"/>
               </w:rPr>
-              <w:t>Đầu ra &amp; Chốt an toàn</w:t>
+              <w:t>Kết quả &amp; Kiểm soát an toàn</w:t>
             </w:r>
           </w:p>
         </w:tc>
@@ -3361,7 +3361,7 @@
                 <w:color w:val="0C4A6E"/>
                 <w:sz w:val="17"/>
               </w:rPr>
-              <w:t>Căn cứ chứng minh</w:t>
+              <w:t>Nguồn gốc thông tin</w:t>
             </w:r>
           </w:p>
         </w:tc>
@@ -3383,7 +3383,7 @@
                 <w:color w:val="334155"/>
                 <w:sz w:val="17"/>
               </w:rPr>
-              <w:t>ChatGPT không chỉ ra được dòng nào do ai nói; MediTrace gắn Turn ID chính xác 100% cho từng phát biểu.</w:t>
+              <w:t>Mô hình đám mây không chỉ ra được dòng nào do ai nói; MediTrace lưu rõ mã số câu thoại [Ti] cho từng nội dung.</w:t>
             </w:r>
           </w:p>
         </w:tc>
@@ -3405,7 +3405,7 @@
                 <w:color w:val="334155"/>
                 <w:sz w:val="17"/>
               </w:rPr>
-              <w:t>Claim-to-Turn Provenance</w:t>
+              <w:t>Lưu vết câu thoại gốc (Turn ID)</w:t>
             </w:r>
           </w:p>
         </w:tc>
@@ -3428,7 +3428,7 @@
                 <w:color w:val="10B981"/>
                 <w:sz w:val="17"/>
               </w:rPr>
-              <w:t>Truy vết nguồn gốc từng câu</w:t>
+              <w:t>Dễ dàng tra cứu lại câu nói gốc</w:t>
             </w:r>
           </w:p>
         </w:tc>
@@ -3453,7 +3453,7 @@
                 <w:color w:val="0C4A6E"/>
                 <w:sz w:val="17"/>
               </w:rPr>
-              <w:t>Kiểm soát Ảo giác</w:t>
+              <w:t>Kiểm soát thông tin sai</w:t>
             </w:r>
           </w:p>
         </w:tc>
@@ -3475,7 +3475,7 @@
                 <w:color w:val="334155"/>
                 <w:sz w:val="17"/>
               </w:rPr>
-              <w:t>ChatGPT bịa đặt 5.2% thông tin trong ca phức tạp; MediTrace 0.0% ảo giác nhờ 7 trạm an ninh K1-K7.</w:t>
+              <w:t>Mô hình tự do dễ tự điền số liệu khi gặp ca phức tạp; MediTrace kiểm định qua quy trình 7 bước.</w:t>
             </w:r>
           </w:p>
         </w:tc>
@@ -3497,7 +3497,7 @@
                 <w:color w:val="334155"/>
                 <w:sz w:val="17"/>
               </w:rPr>
-              <w:t>Rule-based Symbolic Gate</w:t>
+              <w:t>Kiểm tra logic xác định độc lập</w:t>
             </w:r>
           </w:p>
         </w:tc>
@@ -3520,7 +3520,7 @@
                 <w:color w:val="10B981"/>
                 <w:sz w:val="17"/>
               </w:rPr>
-              <w:t>Bảo đảm tính xác thực lâm sàng</w:t>
+              <w:t>Đảm bảo tính xác thực của hồ sơ</w:t>
             </w:r>
           </w:p>
         </w:tc>
@@ -3545,7 +3545,7 @@
                 <w:color w:val="0C4A6E"/>
                 <w:sz w:val="17"/>
               </w:rPr>
-              <w:t>Pháp lý Y tế NĐ 13</w:t>
+              <w:t>Bảo mật dữ liệu y tế</w:t>
             </w:r>
           </w:p>
         </w:tc>
@@ -3567,7 +3567,7 @@
                 <w:color w:val="334155"/>
                 <w:sz w:val="17"/>
               </w:rPr>
-              <w:t>ChatGPT gửi bệnh án lên máy chủ nước ngoài (vi phạm luật); MediTrace chạy cục bộ tại bệnh viện.</w:t>
+              <w:t>Mô hình đám mây gửi dữ liệu ra máy chủ bên ngoài; MediTrace xử lý hoàn toàn tại máy tính phòng khám.</w:t>
             </w:r>
           </w:p>
         </w:tc>
@@ -3589,7 +3589,7 @@
                 <w:color w:val="334155"/>
                 <w:sz w:val="17"/>
               </w:rPr>
-              <w:t>On-premise Deployment</w:t>
+              <w:t>Vận hành cục bộ (On-premise)</w:t>
             </w:r>
           </w:p>
         </w:tc>
@@ -3612,7 +3612,7 @@
                 <w:color w:val="10B981"/>
                 <w:sz w:val="17"/>
               </w:rPr>
-              <w:t>Bảo mật dữ liệu cá nhân 100%</w:t>
+              <w:t>Bảo mật thông tin người bệnh theo NĐ 13</w:t>
             </w:r>
           </w:p>
         </w:tc>
@@ -3637,7 +3637,7 @@
                 <w:color w:val="0C4A6E"/>
                 <w:sz w:val="17"/>
               </w:rPr>
-              <w:t>An toàn Dược lý</w:t>
+              <w:t>An toàn đơn thuốc</w:t>
             </w:r>
           </w:p>
         </w:tc>
@@ -3659,7 +3659,7 @@
                 <w:color w:val="334155"/>
                 <w:sz w:val="17"/>
               </w:rPr>
-              <w:t>ChatGPT không cộng dồn liều khi dùng nhiều biệt dược; MediTrace có engine Dược lý khóa cứng.</w:t>
+              <w:t>Mô hình tự do không tự cộng dồn liều khi kê nhiều biệt dược; MediTrace có module dược lý tự động kiểm tra.</w:t>
             </w:r>
           </w:p>
         </w:tc>
@@ -3681,7 +3681,7 @@
                 <w:color w:val="334155"/>
                 <w:sz w:val="17"/>
               </w:rPr>
-              <w:t>Clinical Pharmacology Engine</w:t>
+              <w:t>Module kiểm soát an toàn đơn thuốc</w:t>
             </w:r>
           </w:p>
         </w:tc>
@@ -3704,7 +3704,7 @@
                 <w:color w:val="10B981"/>
                 <w:sz w:val="17"/>
               </w:rPr>
-              <w:t>Triệt tiêu lỗi ngộ độc thuốc</w:t>
+              <w:t>Ngăn ngừa nguy cơ quá liều thuốc</w:t>
             </w:r>
           </w:p>
         </w:tc>
@@ -3730,9 +3730,9 @@
           <w:rFonts w:ascii="Segoe UI" w:hAnsi="Segoe UI"/>
           <w:b/>
           <w:color w:val="0C4A6E"/>
-          <w:sz w:val="30"/>
+          <w:sz w:val="28"/>
         </w:rPr>
-        <w:t>FLOW 6: Đường ống Kiểm thử Thực nghiệm 1.330 Test Tự động CI/CD</w:t>
+        <w:t>FLOW 6: Dữ liệu Thực nghiệm &amp; Quy trình Kiểm thử Tự động (1.330 Trường hợp Kiểm thử)</w:t>
       </w:r>
     </w:p>
     <w:p>
@@ -3810,17 +3810,17 @@
                 <w:rFonts w:ascii="Segoe UI" w:hAnsi="Segoe UI"/>
                 <w:b/>
                 <w:color w:val="0C4A6E"/>
-                <w:sz w:val="20"/>
+                <w:sz w:val="19"/>
               </w:rPr>
-              <w:t xml:space="preserve">[ĐIỂM ĐẮT GIÁ CỦA FLOW 6 (CHỨNG NHẬN CHẤT LƯỢNG 100% PASS)] </w:t>
+              <w:t xml:space="preserve">[ĐIỂM TRỌNG TÂM CỦA FLOW 6 (KẾT QUẢ KIỂM ĐỊNH TOÀN DIỆN)] </w:t>
             </w:r>
             <w:r>
               <w:rPr>
                 <w:rFonts w:ascii="Segoe UI" w:hAnsi="Segoe UI"/>
                 <w:color w:val="334155"/>
-                <w:sz w:val="19"/>
+                <w:sz w:val="18"/>
               </w:rPr>
-              <w:t>Toàn bộ 1.330 bài kiểm thử tự động (Unit, Integration, Regression Tests) chạy tự động qua đường ống CI/CD vượt qua 100% trong 120 giây. Bộ dữ liệu thiết kế chuẩn Template-Disjoint (200 khuôn ca bệnh độc lập), chứng minh hệ thống vận hành ổn định tuyệt đối và không bị học vẹt.</w:t>
+              <w:t>Toàn bộ 1.330 trường hợp kiểm thử tự động (Unit, Integration, Regression Tests) chạy tự động qua đường ống CI/CD đạt kết quả thành công 100%. Bộ dữ liệu thiết kế theo nguyên tắc độc lập (200 khuôn ca bệnh độc lập), chứng minh hệ thống vận hành ổn định và có khả năng khái quát tốt trên các ca bệnh mới.</w:t>
             </w:r>
           </w:p>
         </w:tc>
@@ -3871,7 +3871,7 @@
                 <w:color w:val="FFFFFF"/>
                 <w:sz w:val="18"/>
               </w:rPr>
-              <w:t>Trạm Xử lý</w:t>
+              <w:t>Bước Xử lý</w:t>
             </w:r>
           </w:p>
         </w:tc>
@@ -3894,7 +3894,7 @@
                 <w:color w:val="FFFFFF"/>
                 <w:sz w:val="18"/>
               </w:rPr>
-              <w:t>Nhiệm vụ / Input</w:t>
+              <w:t>Mục tiêu / Dữ liệu vào</w:t>
             </w:r>
           </w:p>
         </w:tc>
@@ -3940,7 +3940,7 @@
                 <w:color w:val="FFFFFF"/>
                 <w:sz w:val="18"/>
               </w:rPr>
-              <w:t>Đầu ra &amp; Chốt an toàn</w:t>
+              <w:t>Kết quả &amp; Kiểm soát an toàn</w:t>
             </w:r>
           </w:p>
         </w:tc>
@@ -3965,7 +3965,7 @@
                 <w:color w:val="0C4A6E"/>
                 <w:sz w:val="17"/>
               </w:rPr>
-              <w:t>200 Khuôn Template-Disjoint</w:t>
+              <w:t>200 Khuôn Ca bệnh Độc lập</w:t>
             </w:r>
           </w:p>
         </w:tc>
@@ -3987,7 +3987,7 @@
                 <w:color w:val="334155"/>
                 <w:sz w:val="17"/>
               </w:rPr>
-              <w:t>Phân tách khuôn tập Huấn luyện và tập Đánh giá độc lập 100%</w:t>
+              <w:t>Tách biệt hoàn toàn ca bệnh kiểm thử với dữ liệu huấn luyện</w:t>
             </w:r>
           </w:p>
         </w:tc>
@@ -4032,7 +4032,7 @@
                 <w:color w:val="10B981"/>
                 <w:sz w:val="17"/>
               </w:rPr>
-              <w:t>Chống học vẹt, kiểm định ca mới</w:t>
+              <w:t>Đảm bảo tính khách quan khi đánh giá</w:t>
             </w:r>
           </w:p>
         </w:tc>
@@ -4057,7 +4057,7 @@
                 <w:color w:val="0C4A6E"/>
                 <w:sz w:val="17"/>
               </w:rPr>
-              <w:t>5.000 Hội thoại Đa biến</w:t>
+              <w:t>5.000 Hội thoại Mô phỏng</w:t>
             </w:r>
           </w:p>
         </w:tc>
@@ -4079,7 +4079,7 @@
                 <w:color w:val="334155"/>
                 <w:sz w:val="17"/>
               </w:rPr>
-              <w:t>Tổ hợp bệnh nền kết hợp, phương ngữ 3 miền, cách gọi thuốc dân gian</w:t>
+              <w:t>Tổ hợp bệnh nền, từ ngữ địa phương 3 miền, cách gọi thuốc dân gian</w:t>
             </w:r>
           </w:p>
         </w:tc>
@@ -4101,7 +4101,7 @@
                 <w:color w:val="334155"/>
                 <w:sz w:val="17"/>
               </w:rPr>
-              <w:t>Dynamic Entity &amp; Slot Perturbation</w:t>
+              <w:t>Mô phỏng đa biến thể ngữ cảnh</w:t>
             </w:r>
           </w:p>
         </w:tc>
@@ -4124,7 +4124,7 @@
                 <w:color w:val="10B981"/>
                 <w:sz w:val="17"/>
               </w:rPr>
-              <w:t>Phản ánh 100% thực tế khám bệnh</w:t>
+              <w:t>Phản ánh sát thực tế giao tiếp khám bệnh</w:t>
             </w:r>
           </w:p>
         </w:tc>
@@ -4149,7 +4149,7 @@
                 <w:color w:val="0C4A6E"/>
                 <w:sz w:val="17"/>
               </w:rPr>
-              <w:t>300 Ca bệnh Đối đầu</w:t>
+              <w:t>300 Ca Bẫy Sai sót</w:t>
             </w:r>
           </w:p>
         </w:tc>
@@ -4171,7 +4171,7 @@
                 <w:color w:val="334155"/>
                 <w:sz w:val="17"/>
               </w:rPr>
-              <w:t>Kiểm thử các tình huống bẫy nói nhầm, tiếng ồn, tương tác thuốc nguy hiểm</w:t>
+              <w:t>Kiểm thử các tình huống nói nhầm, tiếng ồn, tương tác thuốc nguy hiểm</w:t>
             </w:r>
           </w:p>
         </w:tc>
@@ -4193,7 +4193,7 @@
                 <w:color w:val="334155"/>
                 <w:sz w:val="17"/>
               </w:rPr>
-              <w:t>Adversarial Stress-Testing Framework</w:t>
+              <w:t>Khung kiểm thử thử thách (Adversarial Testing)</w:t>
             </w:r>
           </w:p>
         </w:tc>
@@ -4216,7 +4216,7 @@
                 <w:color w:val="10B981"/>
                 <w:sz w:val="17"/>
               </w:rPr>
-              <w:t>Đo lường độ chịu lỗi tối đa</w:t>
+              <w:t>Đo lường độ chịu lỗi và tính ổn định</w:t>
             </w:r>
           </w:p>
         </w:tc>
@@ -4241,7 +4241,7 @@
                 <w:color w:val="0C4A6E"/>
                 <w:sz w:val="17"/>
               </w:rPr>
-              <w:t>Đường ống CI/CD 1.330 Test</w:t>
+              <w:t>Quy trình CI/CD 1.330 Test</w:t>
             </w:r>
           </w:p>
         </w:tc>
@@ -4263,7 +4263,7 @@
                 <w:color w:val="334155"/>
                 <w:sz w:val="17"/>
               </w:rPr>
-              <w:t>Chạy hồi quy tự động toàn bộ module trước mỗi lần đóng gói và deploy</w:t>
+              <w:t>Tự động chạy kiểm thử hồi quy trước mỗi lần cập nhật mã nguồn</w:t>
             </w:r>
           </w:p>
         </w:tc>
@@ -4285,7 +4285,7 @@
                 <w:color w:val="334155"/>
                 <w:sz w:val="17"/>
               </w:rPr>
-              <w:t>PyTest Test Automation Pipeline</w:t>
+              <w:t>Hệ thống kiểm thử tự động PyTest</w:t>
             </w:r>
           </w:p>
         </w:tc>
@@ -4308,7 +4308,7 @@
                 <w:color w:val="10B981"/>
                 <w:sz w:val="17"/>
               </w:rPr>
-              <w:t>1.330 PASSED (0 lỗi, 100% tin cậy)</w:t>
+              <w:t>1.330 PASSED (100% đạt kết quả)</w:t>
             </w:r>
           </w:p>
         </w:tc>
@@ -4334,9 +4334,9 @@
           <w:rFonts w:ascii="Segoe UI" w:hAnsi="Segoe UI"/>
           <w:b/>
           <w:color w:val="0C4A6E"/>
-          <w:sz w:val="30"/>
+          <w:sz w:val="28"/>
         </w:rPr>
-        <w:t>FLOW 7: Quy trình Bác sĩ Khám Thực tế &amp; Click-to-Verify (&lt; 60 Giây)</w:t>
+        <w:t>FLOW 7: Quy trình Bác sĩ Sử dụng Hệ thống trong Ca khám Bệnh (&lt; 60 Giây Thao tác)</w:t>
       </w:r>
     </w:p>
     <w:p>
@@ -4414,17 +4414,17 @@
                 <w:rFonts w:ascii="Segoe UI" w:hAnsi="Segoe UI"/>
                 <w:b/>
                 <w:color w:val="0C4A6E"/>
-                <w:sz w:val="20"/>
+                <w:sz w:val="19"/>
               </w:rPr>
-              <w:t xml:space="preserve">[ĐIỂM ĐẮT GIÁ CỦA FLOW 7 (GIẢI PHÓNG ĐÔI TAY THẦY THUỐC)] </w:t>
+              <w:t xml:space="preserve">[ĐIỂM TRỌNG TÂM CỦA FLOW 7 (TỐI ƯU HÓA QUY TRÌNH LÀM VIỆC CỦA BÁC SĨ)] </w:t>
             </w:r>
             <w:r>
               <w:rPr>
                 <w:rFonts w:ascii="Segoe UI" w:hAnsi="Segoe UI"/>
                 <w:color w:val="334155"/>
-                <w:sz w:val="19"/>
+                <w:sz w:val="18"/>
               </w:rPr>
-              <w:t>Bác sĩ chỉ cần dành 20 giây liếc mắt nhìn cột BÔI ĐỎ cảnh báo và 1 giây bấm 'Click-to-Verify' để duyệt bệnh án. Giảm 90.6% thời gian gõ máy tính hành chính, tăng thời gian nhìn mắt bệnh nhân lên 88.5%, niêm phong tự động bằng mã băm SHA-256 xuất sang EMR bệnh viện.</w:t>
+              <w:t>Bác sĩ chỉ cần dành khoảng 20 giây xem cột BÔI ĐỎ cảnh báo và 1 giây bấm nghe lại âm thanh gốc khi cần đối chiếu. Giảm đáng kể thời gian nhập liệu thủ công, giúp bác sĩ tập trung thăm khám người bệnh, hồ sơ được niêm phong mã hóa SHA-256 trước khi chuyển sang hệ thống quản lý bệnh viện (EMR).</w:t>
             </w:r>
           </w:p>
         </w:tc>
@@ -4475,7 +4475,7 @@
                 <w:color w:val="FFFFFF"/>
                 <w:sz w:val="18"/>
               </w:rPr>
-              <w:t>Trạm Xử lý</w:t>
+              <w:t>Bước Xử lý</w:t>
             </w:r>
           </w:p>
         </w:tc>
@@ -4498,7 +4498,7 @@
                 <w:color w:val="FFFFFF"/>
                 <w:sz w:val="18"/>
               </w:rPr>
-              <w:t>Nhiệm vụ / Input</w:t>
+              <w:t>Mục tiêu / Dữ liệu vào</w:t>
             </w:r>
           </w:p>
         </w:tc>
@@ -4544,7 +4544,7 @@
                 <w:color w:val="FFFFFF"/>
                 <w:sz w:val="18"/>
               </w:rPr>
-              <w:t>Đầu ra &amp; Chốt an toàn</w:t>
+              <w:t>Kết quả &amp; Kiểm soát an toàn</w:t>
             </w:r>
           </w:p>
         </w:tc>
@@ -4569,7 +4569,7 @@
                 <w:color w:val="0C4A6E"/>
                 <w:sz w:val="17"/>
               </w:rPr>
-              <w:t>Bước 1: Khám bệnh (5-7 phút)</w:t>
+              <w:t>Bước 1: Khám bệnh (3-5 phút)</w:t>
             </w:r>
           </w:p>
         </w:tc>
@@ -4591,7 +4591,7 @@
                 <w:color w:val="334155"/>
                 <w:sz w:val="17"/>
               </w:rPr>
-              <w:t>Bác sĩ rảnh tay giao tiếp mắt-đối-mắt với bệnh nhân, hệ thống tự lắng nghe</w:t>
+              <w:t>Bác sĩ tập trung giao tiếp và khám cho người bệnh, hệ thống tự động tiếp nhận âm thanh</w:t>
             </w:r>
           </w:p>
         </w:tc>
@@ -4613,7 +4613,7 @@
                 <w:color w:val="334155"/>
                 <w:sz w:val="17"/>
               </w:rPr>
-              <w:t>Ambient Clinical Scribe tại chỗ</w:t>
+              <w:t>Thu âm thụ động tại chỗ trên máy tính</w:t>
             </w:r>
           </w:p>
         </w:tc>
@@ -4636,7 +4636,7 @@
                 <w:color w:val="10B981"/>
                 <w:sz w:val="17"/>
               </w:rPr>
-              <w:t>Thu nhận trọn vẹn ngữ cảnh</w:t>
+              <w:t>Thu nhận đầy đủ ngữ cảnh cuộc khám</w:t>
             </w:r>
           </w:p>
         </w:tc>
@@ -4661,7 +4661,7 @@
                 <w:color w:val="0C4A6E"/>
                 <w:sz w:val="17"/>
               </w:rPr>
-              <w:t>Bước 2: Bản nháp (30 giây)</w:t>
+              <w:t>Bước 2: Lập Bản nháp (30 giây)</w:t>
             </w:r>
           </w:p>
         </w:tc>
@@ -4683,7 +4683,7 @@
                 <w:color w:val="334155"/>
                 <w:sz w:val="17"/>
               </w:rPr>
-              <w:t>Hệ thống tự động dựng bản nháp SOAP có cấu trúc kèm trích dẫn căn cứ</w:t>
+              <w:t>Hệ thống tự động dựng bản nháp SOAP có cấu trúc kèm số thứ tự câu thoại</w:t>
             </w:r>
           </w:p>
         </w:tc>
@@ -4705,7 +4705,7 @@
                 <w:color w:val="334155"/>
                 <w:sz w:val="17"/>
               </w:rPr>
-              <w:t>Neuro-symbolic Pipeline xử lý tự động</w:t>
+              <w:t>Đường ống xử lý tự động đa tầng</w:t>
             </w:r>
           </w:p>
         </w:tc>
@@ -4753,7 +4753,7 @@
                 <w:color w:val="0C4A6E"/>
                 <w:sz w:val="17"/>
               </w:rPr>
-              <w:t>Bước 3: Liếc mắt (20 giây)</w:t>
+              <w:t>Bước 3: Rà soát Cảnh báo (20 giây)</w:t>
             </w:r>
           </w:p>
         </w:tc>
@@ -4775,7 +4775,7 @@
                 <w:color w:val="334155"/>
                 <w:sz w:val="17"/>
               </w:rPr>
-              <w:t>Bác sĩ chỉ cần nhìn cột phải xem các mục BÔI ĐỎ cảnh báo thuốc/liều</w:t>
+              <w:t>Bác sĩ xem nhanh mục CẦN BÁC SĨ XÁC NHẬN (tên thuốc nghi ngờ, cảnh báo tương tác)</w:t>
             </w:r>
           </w:p>
         </w:tc>
@@ -4797,7 +4797,7 @@
                 <w:color w:val="334155"/>
                 <w:sz w:val="17"/>
               </w:rPr>
-              <w:t>Giao diện tối ưu thị giác lâm sàng</w:t>
+              <w:t>Giao diện hiển thị trực quan các điểm bôi đỏ</w:t>
             </w:r>
           </w:p>
         </w:tc>
@@ -4820,7 +4820,7 @@
                 <w:color w:val="10B981"/>
                 <w:sz w:val="17"/>
               </w:rPr>
-              <w:t>Phát hiện ngay điểm bất thường</w:t>
+              <w:t>Phát hiện ngay điểm cần lưu ý</w:t>
             </w:r>
           </w:p>
         </w:tc>
@@ -4845,7 +4845,7 @@
                 <w:color w:val="0C4A6E"/>
                 <w:sz w:val="17"/>
               </w:rPr>
-              <w:t>Bước 4-5: Duyệt &amp; Niêm phong</w:t>
+              <w:t>Bước 4-5: Ký duyệt &amp; In hướng dẫn</w:t>
             </w:r>
           </w:p>
         </w:tc>
@@ -4867,7 +4867,7 @@
                 <w:color w:val="334155"/>
                 <w:sz w:val="17"/>
               </w:rPr>
-              <w:t>Bác sĩ bấm Click-to-Verify trong 1s; hệ thống niêm phong SHA-256 đẩy sang EMR</w:t>
+              <w:t>Bác sĩ bấm nghe lại âm thanh đối soát nếu cần, bấm ký duyệt và in phiếu hướng dẫn</w:t>
             </w:r>
           </w:p>
         </w:tc>
@@ -4889,7 +4889,7 @@
                 <w:color w:val="334155"/>
                 <w:sz w:val="17"/>
               </w:rPr>
-              <w:t>Chữ ký số băm SHA-256 &amp; Chuẩn HL7 FHIR</w:t>
+              <w:t>Mã hóa băm SHA-256 &amp; Chuẩn tích hợp HL7 FHIR</w:t>
             </w:r>
           </w:p>
         </w:tc>
@@ -4912,7 +4912,7 @@
                 <w:color w:val="10B981"/>
                 <w:sz w:val="17"/>
               </w:rPr>
-              <w:t>Bệnh án điện tử chính thức hợp pháp</w:t>
+              <w:t>Bệnh án điện tử chính thức hoàn tất</w:t>
             </w:r>
           </w:p>
         </w:tc>
@@ -4938,7 +4938,7 @@
           <w:rFonts w:ascii="Segoe UI" w:hAnsi="Segoe UI"/>
           <w:b/>
           <w:color w:val="0C4A6E"/>
-          <w:sz w:val="30"/>
+          <w:sz w:val="28"/>
         </w:rPr>
         <w:t>PHỤ LỤC: Sơ đồ Bảng số liệu Thực nghiệm Đối chứng</w:t>
       </w:r>
@@ -5018,7 +5018,7 @@
                 <w:rFonts w:ascii="Segoe UI" w:hAnsi="Segoe UI"/>
                 <w:b/>
                 <w:color w:val="0C4A6E"/>
-                <w:sz w:val="20"/>
+                <w:sz w:val="19"/>
               </w:rPr>
               <w:t xml:space="preserve">[KẾT LUẬN TOÀN BỘ BÁO CÁO SƠ ĐỒ FLOW] </w:t>
             </w:r>
@@ -5026,9 +5026,9 @@
               <w:rPr>
                 <w:rFonts w:ascii="Segoe UI" w:hAnsi="Segoe UI"/>
                 <w:color w:val="334155"/>
-                <w:sz w:val="19"/>
+                <w:sz w:val="18"/>
               </w:rPr>
-              <w:t>Bộ 7 Sơ đồ Flow Master cùng bảng đối chứng thực nghiệm cung cấp bằng chứng kỹ thuật và trực quan toàn diện nhất về tính khả thi, tính vượt trội và độ an toàn của hệ thống MediTrace Sentinel. Hệ thống đã sẵn sàng 100% để bảo vệ trước Hội đồng Giám khảo và triển khai thực tiễn.</w:t>
+              <w:t>Bộ 7 Sơ đồ Lưu đồ quy trình cùng bảng đối chứng thực nghiệm cung cấp bằng chứng kỹ thuật và trực quan toàn diện về tính khả thi, độ tin cậy và mức độ an toàn của hệ thống MediTrace Sentinel. Hệ thống đã sẵn sàng 100% để báo cáo trước Hội đồng Giám khảo và triển khai ứng dụng thực tế.</w:t>
             </w:r>
           </w:p>
         </w:tc>
@@ -5064,7 +5064,7 @@
         <w:color w:val="94A3B8"/>
         <w:sz w:val="17"/>
       </w:rPr>
-      <w:t>Tài liệu Thiết kế Kiến trúc &amp; Bằng chứng Thẩm định Hệ thống | Dự án MediTrace Sentinel</w:t>
+      <w:t>Tài liệu Thiết kế Kỹ thuật &amp; Bằng chứng Thẩm định Hệ thống | Dự án MediTrace Sentinel</w:t>
     </w:r>
   </w:p>
 </w:ftr>
@@ -5083,7 +5083,7 @@
         <w:color w:val="94A3B8"/>
         <w:sz w:val="17"/>
       </w:rPr>
-      <w:t>MediTrace Sentinel | Báo cáo Bộ Sơ đồ Flow Kiến trúc &amp; Quy trình Lâm sàng</w:t>
+      <w:t>MediTrace Sentinel | Báo cáo Sơ đồ Lưu đồ Kiến trúc &amp; Quy trình Xử lý</w:t>
     </w:r>
   </w:p>
 </w:hdr>

</xml_diff>